<commit_message>
Se arreglan los errores de compilación y se mejora el adr 002
</commit_message>
<xml_diff>
--- a/docs/informe/Informe-Final-Ciudad-Inteligente.docx
+++ b/docs/informe/Informe-Final-Ciudad-Inteligente.docx
@@ -5048,7 +5048,7 @@
                 <w:sz w:val="20"/>
                 <w:lang w:val="es-ES"/>
               </w:rPr>
-              <w:t>Go como lenguaje y tiempo de ejecución</w:t>
+              <w:t>Go como lenguaje, por decisión del equipo</w:t>
             </w:r>
           </w:p>
         </w:tc>
@@ -5779,7 +5779,7 @@
         <w:rPr>
           <w:lang w:val="es-ES"/>
         </w:rPr>
-        <w:t>La elección de lenguaje es de las más caras de revertir, porque cambiarlo equivale a reescribir el sistema (ADR-002). Para el problema que se resuelve habrían servido varios lenguajes, de modo que el criterio no fue la elegancia ni la familiaridad, sino cuánto cuesta operar el resultado: los servicios conviven con Kafka y Redis en dos servidores propios que no crecen, y quien los opere es un equipo reducido sin un especialista en máquinas virtuales.</w:t>
+        <w:t xml:space="preserve">La elección de lenguaje es de las más caras de revertir, porque cambiarlo equivale a reescribir el sistema (ADR-002). Conviene decir primero algo que la presentación del proyecto dejó claro: para este sistema habrían servido varios lenguajes. Con un volumen de decenas de eventos por segundo, Java con Spring Boot, Python o Node.js pueden ingerir, correlacionar y archivar los eventos con holgura. Java cuenta además con el cliente de Kafka más maduro, con productor idempotente completo, y permite confirmar los offsets manualmente. Las decisiones que hacen correcto este sistema salen de razonar el dominio y se habrían tomado igual en cualquier lenguaje.</w:t>
       </w:r>
     </w:p>
     <w:p>
@@ -5795,7 +5795,7 @@
         <w:rPr>
           <w:lang w:val="es-ES"/>
         </w:rPr>
-        <w:t>Frente a Java con Spring Boot, que es el stack más extendido y cuenta con el cliente de Kafka más maduro, pesó la huella. Una imagen base de Java (eclipse-temurin 17 sobre Alpine) ocupa 257 MB antes de añadir la aplicación, y un servicio Spring Boot consume del orden de cientos de megabytes. Los servicios en Go se midieron en 22 a 29 MB de imagen completa, 13 a 18 MB de memoria residente y 7 a 50 milisegundos de arranque. Con los servicios, Kafka, Redis, Prometheus y Grafana repartidos en dos máquinas, esa diferencia decide si la plataforma cabe holgada o al límite. Además, un arranque en milisegundos hace que reiniciar un contenedor no interrumpa la ingesta.</w:t>
+        <w:t xml:space="preserve">La razón por la que se eligió Go es del equipo y no del problema: ninguno de nosotros había programado en ese lenguaje y el proyecto era una buena oportunidad para aprenderlo. Otros lenguajes nos habrían dado un camino más corto y con menos tropiezos, y lo sabíamos; elegimos el más difícil a propósito. Un proyecto de curso produce el sistema y también lo que el equipo aprende al construirlo, y quisimos que eso incluyera un lenguaje nuevo y muy usado en infraestructura: están escritos en Go varios de los programas que usamos en este mismo proyecto, como Prometheus, Grafana y Docker. Es una razón válida para un proyecto académico. Para un cliente que paga por un sistema, la elección natural habría sido el lenguaje que el equipo ya domina.</w:t>
       </w:r>
     </w:p>
     <w:p>
@@ -5811,8 +5811,136 @@
         <w:rPr>
           <w:lang w:val="es-ES"/>
         </w:rPr>
-        <w:lastRenderedPageBreak/>
-        <w:t>Hubo también una razón de diseño y no solo de recursos. Las abstracciones de Spring sobre Kafka ocultan justamente lo que este sistema necesita controlar: cuándo se confirma un offset y cuándo se considera publicado un mensaje, que son decisiones centrales de la resiliencia (ADR-006). En Go confirmar manualmente es una línea de código; con el framework habría que pelear contra la abstracción para tomar la misma decisión.</w:t>
+        <w:t xml:space="preserve">Al usarlo encontramos ventajas que no fueron la causa de la elección, pero que hacen razonable defenderla:</w:t>
+      </w:r>
+    </w:p>
+    <w:p>
+      <w:pPr>
+        <w:spacing w:after="60"/>
+        <w:ind w:left="720" w:hanging="283"/>
+        <w:jc w:val="both"/>
+        <w:rPr>
+          <w:lang w:val="es-ES"/>
+        </w:rPr>
+      </w:pPr>
+      <w:r>
+        <w:rPr>
+          <w:lang w:val="es-ES"/>
+        </w:rPr>
+        <w:t xml:space="preserve">•  </w:t>
+      </w:r>
+      <w:r>
+        <w:rPr>
+          <w:b/>
+          <w:lang w:val="es-ES"/>
+        </w:rPr>
+        <w:t xml:space="preserve">Un binario por servicio, sin runtime externo.</w:t>
+      </w:r>
+      <w:r>
+        <w:rPr>
+          <w:lang w:val="es-ES"/>
+        </w:rPr>
+        <w:t xml:space="preserve"> Imágenes de 22 a 29 MB, memoria residente de 13 a 18 MB y arranque en milisegundos, frente a los 257 MB que ocupa una imagen base de Java antes de añadir la aplicación. Es una diferencia real, pero a este volumen no es decisiva.</w:t>
+      </w:r>
+    </w:p>
+    <w:p>
+      <w:pPr>
+        <w:spacing w:after="60"/>
+        <w:ind w:left="720" w:hanging="283"/>
+        <w:jc w:val="both"/>
+        <w:rPr>
+          <w:lang w:val="es-ES"/>
+        </w:rPr>
+      </w:pPr>
+      <w:r>
+        <w:rPr>
+          <w:lang w:val="es-ES"/>
+        </w:rPr>
+        <w:t xml:space="preserve">•  </w:t>
+      </w:r>
+      <w:r>
+        <w:rPr>
+          <w:b/>
+          <w:lang w:val="es-ES"/>
+        </w:rPr>
+        <w:t xml:space="preserve">Una concurrencia que encaja con el problema.</w:t>
+      </w:r>
+      <w:r>
+        <w:rPr>
+          <w:lang w:val="es-ES"/>
+        </w:rPr>
+        <w:t xml:space="preserve"> El persister acumula un lote mientras vence un temporizador y atiende una señal de apagado con tres goroutines y un </w:t>
+      </w:r>
+      <w:r>
+        <w:rPr>
+          <w:rFonts w:ascii="Consolas" w:eastAsia="Consolas" w:hAnsi="Consolas" w:cs="Consolas"/>
+          <w:sz w:val="21"/>
+          <w:lang w:val="es-ES"/>
+        </w:rPr>
+        <w:t xml:space="preserve">select</w:t>
+      </w:r>
+      <w:r>
+        <w:rPr>
+          <w:lang w:val="es-ES"/>
+        </w:rPr>
+        <w:t xml:space="preserve">.</w:t>
+      </w:r>
+    </w:p>
+    <w:p>
+      <w:pPr>
+        <w:spacing w:after="60"/>
+        <w:ind w:left="720" w:hanging="283"/>
+        <w:jc w:val="both"/>
+        <w:rPr>
+          <w:lang w:val="es-ES"/>
+        </w:rPr>
+      </w:pPr>
+      <w:r>
+        <w:rPr>
+          <w:lang w:val="es-ES"/>
+        </w:rPr>
+        <w:t xml:space="preserve">•  </w:t>
+      </w:r>
+      <w:r>
+        <w:rPr>
+          <w:b/>
+          <w:lang w:val="es-ES"/>
+        </w:rPr>
+        <w:t xml:space="preserve">Pocas dependencias y las mismas herramientas para todos.</w:t>
+      </w:r>
+      <w:r>
+        <w:rPr>
+          <w:lang w:val="es-ES"/>
+        </w:rPr>
+        <w:t xml:space="preserve"> Entre tres y siete bibliotecas directas por servicio, y herramientas de serie (</w:t>
+      </w:r>
+      <w:r>
+        <w:rPr>
+          <w:rFonts w:ascii="Consolas" w:eastAsia="Consolas" w:hAnsi="Consolas" w:cs="Consolas"/>
+          <w:sz w:val="21"/>
+          <w:lang w:val="es-ES"/>
+        </w:rPr>
+        <w:t xml:space="preserve">gofmt</w:t>
+      </w:r>
+      <w:r>
+        <w:rPr>
+          <w:lang w:val="es-ES"/>
+        </w:rPr>
+        <w:t xml:space="preserve">, </w:t>
+      </w:r>
+      <w:r>
+        <w:rPr>
+          <w:rFonts w:ascii="Consolas" w:eastAsia="Consolas" w:hAnsi="Consolas" w:cs="Consolas"/>
+          <w:sz w:val="21"/>
+          <w:lang w:val="es-ES"/>
+        </w:rPr>
+        <w:t xml:space="preserve">go vet</w:t>
+      </w:r>
+      <w:r>
+        <w:rPr>
+          <w:lang w:val="es-ES"/>
+        </w:rPr>
+        <w:t xml:space="preserve"> y las pruebas) que dan a todo el equipo las mismas reglas de formato y de verificación.</w:t>
       </w:r>
     </w:p>
     <w:p>
@@ -5828,23 +5956,7 @@
         <w:rPr>
           <w:lang w:val="es-ES"/>
         </w:rPr>
-        <w:t>Node.js con TypeScript y Python se descartaron por otras razones. Su modelo de un solo hilo efectivo obliga a multiplicar procesos para sostener a la vez la correlación, el consumo de Kafka y la atención de peticiones, lo que devuelve la huella que se quería ahorrar. Exigen llevar un intérprete y sus dependencias dentro de la imagen. Y el tipado dinámico es un riesgo en un sistema cuyo núcleo es un contrato de datos, porque los errores de forma aparecen en ejecución.</w:t>
-      </w:r>
-    </w:p>
-    <w:p>
-      <w:pPr>
-        <w:spacing w:after="120"/>
-        <w:ind w:firstLine="720"/>
-        <w:jc w:val="both"/>
-        <w:rPr>
-          <w:lang w:val="es-ES"/>
-        </w:rPr>
-      </w:pPr>
-      <w:r>
-        <w:rPr>
-          <w:lang w:val="es-ES"/>
-        </w:rPr>
-        <w:t>Se aceptaron tres costos de forma explícita:</w:t>
+        <w:t xml:space="preserve">También tuvo costos, que se aceptaron de forma explícita:</w:t>
       </w:r>
     </w:p>
     <w:p>
@@ -5867,7 +5979,7 @@
           <w:b/>
           <w:lang w:val="es-ES"/>
         </w:rPr>
-        <w:t>Sin productor idempotente.</w:t>
+        <w:t xml:space="preserve">Sin productor idempotente.</w:t>
       </w:r>
       <w:r>
         <w:rPr>
@@ -5881,13 +5993,13 @@
           <w:sz w:val="21"/>
           <w:lang w:val="es-ES"/>
         </w:rPr>
-        <w:t>segmentio/kafka-go</w:t>
-      </w:r>
-      <w:r>
-        <w:rPr>
-          <w:lang w:val="es-ES"/>
-        </w:rPr>
-        <w:t>) no lo implementa por completo, y la alternativa (</w:t>
+        <w:t xml:space="preserve">segmentio/kafka-go</w:t>
+      </w:r>
+      <w:r>
+        <w:rPr>
+          <w:lang w:val="es-ES"/>
+        </w:rPr>
+        <w:t xml:space="preserve">) no lo implementa por completo, y la alternativa (</w:t>
       </w:r>
       <w:r>
         <w:rPr>
@@ -5895,13 +6007,13 @@
           <w:sz w:val="21"/>
           <w:lang w:val="es-ES"/>
         </w:rPr>
-        <w:t>confluent-kafka-go</w:t>
-      </w:r>
-      <w:r>
-        <w:rPr>
-          <w:lang w:val="es-ES"/>
-        </w:rPr>
-        <w:t>) depende de una librería en C que habría eliminado el binario estático, una de las razones de elegir Go. Se compensó con idempotencia en el consumidor: reserva del identificador del evento en Redis en el ingestor y el correlator, e inserción que ignora duplicados en el persister. Esa garantía protege además contra reprocesos por rebalanceo o reinicio, no solo contra reintentos de escritura.</w:t>
+        <w:t xml:space="preserve">confluent-kafka-go</w:t>
+      </w:r>
+      <w:r>
+        <w:rPr>
+          <w:lang w:val="es-ES"/>
+        </w:rPr>
+        <w:t xml:space="preserve">) depende de una librería en C que habría eliminado el binario estático. Se compensó con idempotencia en el consumidor, que protege además contra reprocesos por rebalanceo o reinicio. Con Java no habría hecho falta.</w:t>
       </w:r>
     </w:p>
     <w:p>
@@ -5924,13 +6036,13 @@
           <w:b/>
           <w:lang w:val="es-ES"/>
         </w:rPr>
-        <w:t>Trabajo que Spring habría dado resuelto.</w:t>
-      </w:r>
-      <w:r>
-        <w:rPr>
-          <w:lang w:val="es-ES"/>
-        </w:rPr>
-        <w:t xml:space="preserve"> Carga de configuración, middleware HTTP y registro de métricas: unas cuatrocientas líneas que hay que mantener.</w:t>
+        <w:t xml:space="preserve">Tiempo.</w:t>
+      </w:r>
+      <w:r>
+        <w:rPr>
+          <w:lang w:val="es-ES"/>
+        </w:rPr>
+        <w:t xml:space="preserve"> Aprender el lenguaje y escribir lo que Spring habría dado resuelto (configuración, middleware HTTP y registro de métricas, unas cuatrocientas líneas) consumió tiempo que pudo ir a la documentación.</w:t>
       </w:r>
     </w:p>
     <w:p>
@@ -5953,13 +6065,13 @@
           <w:b/>
           <w:lang w:val="es-ES"/>
         </w:rPr>
-        <w:t>Curva de aprendizaje y continuidad.</w:t>
-      </w:r>
-      <w:r>
-        <w:rPr>
-          <w:lang w:val="es-ES"/>
-        </w:rPr>
-        <w:t xml:space="preserve"> Con fecha de entrega fija y, si quien herede el sistema conoce Java y no Go, un costo de adopción. Se mitigó sin usar framework, de modo que lo que hay que entender es el lenguaje y no un ecosistema; con código que explica el porqué de cada decisión no evidente; y con contratos que son esquemas JSON y no bibliotecas, de manera que un servicio puede reescribirse en otro lenguaje sin tocar a los demás (ADR-003).</w:t>
+        <w:t xml:space="preserve">Riesgo de continuidad.</w:t>
+      </w:r>
+      <w:r>
+        <w:rPr>
+          <w:lang w:val="es-ES"/>
+        </w:rPr>
+        <w:t xml:space="preserve"> Si quien herede el sistema conoce Java y no Go, hay un costo de adopción. Se mitigó sin usar framework y con contratos que son esquemas JSON y no bibliotecas, de modo que un servicio puede reescribirse en otro lenguaje, de a uno y sin tocar a los demás (ADR-003).</w:t>
       </w:r>
     </w:p>
     <w:p>
@@ -10883,7 +10995,7 @@
               <w:rPr>
                 <w:sz w:val="20"/>
               </w:rPr>
-              <w:t>15 – 19 MB</w:t>
+              <w:t>13 – 18 MB</w:t>
             </w:r>
           </w:p>
         </w:tc>
@@ -12730,19 +12842,13 @@
         <w:rPr>
           <w:lang w:val="es-ES"/>
         </w:rPr>
-        <w:t>De esa sola premisa se desprendió casi todo lo demás: dónde pasa la frontera entre la red municipal y la nube, dónde se protegen las placas, por qué no se adoptó Kubernetes ni Airflow y por qué se eligió un lenguaje liviano</w:t>
-      </w:r>
-      <w:r>
-        <w:rPr>
-          <w:lang w:val="es-ES"/>
-        </w:rPr>
-        <w:t xml:space="preserve"> como GO</w:t>
-      </w:r>
-      <w:r>
-        <w:rPr>
-          <w:lang w:val="es-ES"/>
-        </w:rPr>
-        <w:t>.</w:t>
+        <w:t>De esa sola premisa se desprendió casi todo lo demás: dónde pasa la frontera entre la red municipal y la nube, dónde se protegen las placas y por qué no se adoptó Kubernetes ni Airflow</w:t>
+      </w:r>
+      <w:r>
+        <w:rPr>
+          <w:lang w:val="es-ES"/>
+        </w:rPr>
+        <w:t>. La elección de Go fue la excepción: la tomó el equipo para aprender un lenguaje nuevo, y Java habría servido igual.</w:t>
       </w:r>
     </w:p>
     <w:p>

</xml_diff>